<commit_message>
Doradjena aplikacija i uputstvo
</commit_message>
<xml_diff>
--- a/UPUTSTVO.docx
+++ b/UPUTSTVO.docx
@@ -585,6 +585,54 @@
           <w:rFonts w:ascii="Arial" w:hAnsi="Arial"/>
           <w:color w:val="1F3B66"/>
         </w:rPr>
+        <w:t>Prijava, registracija i promena lozinke</w:t>
+      </w:r>
+    </w:p>
+    <w:p>
+      <w:pPr>
+        <w:pStyle w:val="ListBullet"/>
+      </w:pPr>
+      <w:r>
+        <w:rPr>
+          <w:rFonts w:ascii="Arial" w:hAnsi="Arial"/>
+          <w:sz w:val="22"/>
+        </w:rPr>
+        <w:t>Login: korisnicko ime/e-mail + lozinka. Prijava automatski vodi na ekran prema ulozi.</w:t>
+      </w:r>
+    </w:p>
+    <w:p>
+      <w:pPr>
+        <w:pStyle w:val="ListBullet"/>
+      </w:pPr>
+      <w:r>
+        <w:rPr>
+          <w:rFonts w:ascii="Arial" w:hAnsi="Arial"/>
+          <w:sz w:val="22"/>
+        </w:rPr>
+        <w:t>Registracija: ime, prezime, korisnicko ime, e-mail, broj telefona, lozinka.</w:t>
+      </w:r>
+    </w:p>
+    <w:p>
+      <w:pPr>
+        <w:pStyle w:val="ListBullet"/>
+      </w:pPr>
+      <w:r>
+        <w:rPr>
+          <w:rFonts w:ascii="Arial" w:hAnsi="Arial"/>
+          <w:sz w:val="22"/>
+        </w:rPr>
+        <w:t>"Zaboravili ste lozinku?": forma za promenu lozinke (korisnicko ime/email/br telefona + nova lozinka + ponovite lozinku -&gt; "Promeni lozinku").</w:t>
+      </w:r>
+    </w:p>
+    <w:p>
+      <w:pPr>
+        <w:pStyle w:val="Heading2"/>
+      </w:pPr>
+      <w:r>
+        <w:rPr>
+          <w:rFonts w:ascii="Arial" w:hAnsi="Arial"/>
+          <w:color w:val="1F3B66"/>
+        </w:rPr>
         <w:t>Administrator</w:t>
       </w:r>
     </w:p>
@@ -650,6 +698,18 @@
     </w:p>
     <w:p>
       <w:pPr>
+        <w:pStyle w:val="ListBullet"/>
+      </w:pPr>
+      <w:r>
+        <w:rPr>
+          <w:rFonts w:ascii="Arial" w:hAnsi="Arial"/>
+          <w:sz w:val="22"/>
+        </w:rPr>
+        <w:t>Dugme "Dopuni izabranu zalihu" - izaberi zalihu iz liste pa unesi kolicinu koja se dodaje na trenutno stanje.</w:t>
+      </w:r>
+    </w:p>
+    <w:p>
+      <w:pPr>
         <w:pStyle w:val="Heading2"/>
       </w:pPr>
       <w:r>
@@ -681,7 +741,7 @@
           <w:rFonts w:ascii="Arial" w:hAnsi="Arial"/>
           <w:sz w:val="22"/>
         </w:rPr>
-        <w:t>Unos: Aktivnost (sa vremenom od-do), Hrana, Ostalo.</w:t>
+        <w:t>Unos: Aktivnost (slobodan tekst + vreme od-do), Hrana i Ostalo. Kod Hrane i Ostalog se vrsta bira iz padajuceg menija (stavke iz magacina) - ne kuca se rucno.</w:t>
       </w:r>
     </w:p>
     <w:p>
@@ -842,7 +902,7 @@
           <w:rFonts w:ascii="Arial" w:hAnsi="Arial"/>
           <w:sz w:val="22"/>
         </w:rPr>
-        <w:t>Odjava -&gt; osoblje / osoblje123 -&gt; izaberi "Maca" (pise Alergije: Piletina) -&gt; Hrana: kolicina 280g -&gt; Potvrdi.</w:t>
+        <w:t>Odjava -&gt; osoblje / osoblje123 -&gt; izaberi "Maca" (pise Alergije: Piletina) -&gt; Hrana: izaberi "Suva hrana (g)" iz padajuceg menija, kolicina 280g -&gt; Potvrdi.</w:t>
       </w:r>
     </w:p>
     <w:p>

</xml_diff>